<commit_message>
docs: manual de usuario corporativo app movil IT VIAL 30 v3.3 con capturas HD, guia de baterias y actualizacion de roadmap v3.4+
</commit_message>
<xml_diff>
--- a/Manuales/APP_MOVIL.docx
+++ b/Manuales/APP_MOVIL.docx
@@ -28,7 +28,7 @@
         </w:p>
       </w:sdtContent>
     </w:sdt>
-    <w:bookmarkStart w:id="61" w:name="X38565deebf43d85875786cd43960c78c28402b8"/>
+    <w:bookmarkStart w:id="62" w:name="X38565deebf43d85875786cd43960c78c28402b8"/>
     <w:p>
       <w:pPr>
         <w:pStyle w:val="Heading1"/>
@@ -37362,13 +37362,22 @@
       </w:r>
     </w:p>
     <w:bookmarkEnd w:id="59"/>
-    <w:bookmarkStart w:id="60" w:name="X227ca0ee402454288859b5141907242abad0bb3"/>
+    <w:bookmarkStart w:id="61" w:name="Xc9c753b248c771848b97ad181d59e62d51acde6"/>
     <w:p>
       <w:pPr>
         <w:pStyle w:val="Heading2"/>
       </w:pPr>
       <w:r>
-        <w:t xml:space="preserve">8. Preguntas abiertas</w:t>
+        <w:t xml:space="preserve">9. Estado Actual — Soluciones Implementadas en la App Oficial v3.2 (</w:t>
+      </w:r>
+      <w:r>
+        <w:rPr>
+          <w:rStyle w:val="VerbatimChar"/>
+        </w:rPr>
+        <w:t xml:space="preserve">BALIZA IT VIAL 30</w:t>
+      </w:r>
+      <w:r>
+        <w:t xml:space="preserve">)</w:t>
       </w:r>
     </w:p>
     <w:p>
@@ -37376,517 +37385,605 @@
         <w:pStyle w:val="FirstParagraph"/>
       </w:pPr>
       <w:r>
-        <w:t xml:space="preserve">Lo que no se puede determinar leyendo el código:</w:t>
+        <w:t xml:space="preserve">En agosto de 2026 se completó la modernización integral de la aplicación Android, pasando de la versión legacy a la versión de producción</w:t>
+      </w:r>
+      <w:r>
+        <w:t xml:space="preserve"> </w:t>
+      </w:r>
+      <w:r>
+        <w:rPr>
+          <w:rStyle w:val="VerbatimChar"/>
+          <w:b/>
+          <w:bCs/>
+        </w:rPr>
+        <w:t xml:space="preserve">Baliza_v3.2.apk</w:t>
+      </w:r>
+      <w:r>
+        <w:t xml:space="preserve">:</w:t>
       </w:r>
     </w:p>
+    <w:tbl>
+      <w:tblPr>
+        <w:tblStyle w:val="Table"/>
+        <w:tblW w:type="auto" w:w="0"/>
+        <w:tblLook w:firstRow="1" w:lastRow="0" w:firstColumn="0" w:lastColumn="0" w:noHBand="0" w:noVBand="0" w:val="0020"/>
+      </w:tblPr>
+      <w:tblGrid>
+        <w:gridCol w:w="3960"/>
+        <w:gridCol w:w="3960"/>
+      </w:tblGrid>
+      <w:tr>
+        <w:trPr>
+          <w:tblHeader w:val="on"/>
+        </w:trPr>
+        <w:tc>
+          <w:tcPr/>
+          <w:p>
+            <w:pPr>
+              <w:pStyle w:val="Compact"/>
+            </w:pPr>
+            <w:r>
+              <w:t xml:space="preserve">Defecto Histórico</w:t>
+            </w:r>
+          </w:p>
+        </w:tc>
+        <w:tc>
+          <w:tcPr/>
+          <w:p>
+            <w:pPr>
+              <w:pStyle w:val="Compact"/>
+            </w:pPr>
+            <w:r>
+              <w:t xml:space="preserve">Solución Implementada en v3.2</w:t>
+            </w:r>
+          </w:p>
+        </w:tc>
+      </w:tr>
+      <w:tr>
+        <w:tc>
+          <w:tcPr/>
+          <w:p>
+            <w:pPr>
+              <w:pStyle w:val="Compact"/>
+            </w:pPr>
+            <w:r>
+              <w:rPr>
+                <w:b/>
+                <w:bCs/>
+              </w:rPr>
+              <w:t xml:space="preserve">D1 (Falta hora "02")</w:t>
+            </w:r>
+          </w:p>
+        </w:tc>
+        <w:tc>
+          <w:tcPr/>
+          <w:p>
+            <w:pPr>
+              <w:pStyle w:val="Compact"/>
+            </w:pPr>
+            <w:r>
+              <w:t xml:space="preserve">Solucionado: arrays de horas generados con las 24 horas del día (00 a 23).</w:t>
+            </w:r>
+          </w:p>
+        </w:tc>
+      </w:tr>
+      <w:tr>
+        <w:tc>
+          <w:tcPr/>
+          <w:p>
+            <w:pPr>
+              <w:pStyle w:val="Compact"/>
+            </w:pPr>
+            <w:r>
+              <w:rPr>
+                <w:b/>
+                <w:bCs/>
+              </w:rPr>
+              <w:t xml:space="preserve">D2/D4 (Encoding UTF-8 vs ISO-8859-1)</w:t>
+            </w:r>
+          </w:p>
+        </w:tc>
+        <w:tc>
+          <w:tcPr/>
+          <w:p>
+            <w:pPr>
+              <w:pStyle w:val="Compact"/>
+            </w:pPr>
+            <w:r>
+              <w:t xml:space="preserve">Solucionado: codificación de tramas forzada explícitamente a</w:t>
+            </w:r>
+            <w:r>
+              <w:t xml:space="preserve"> </w:t>
+            </w:r>
+            <w:r>
+              <w:rPr>
+                <w:rStyle w:val="VerbatimChar"/>
+              </w:rPr>
+              <w:t xml:space="preserve">ISO-8859-1</w:t>
+            </w:r>
+            <w:r>
+              <w:t xml:space="preserve">. Los delimitadores</w:t>
+            </w:r>
+            <w:r>
+              <w:t xml:space="preserve"> </w:t>
+            </w:r>
+            <w:r>
+              <w:rPr>
+                <w:rStyle w:val="VerbatimChar"/>
+              </w:rPr>
+              <w:t xml:space="preserve">0xBF</w:t>
+            </w:r>
+            <w:r>
+              <w:t xml:space="preserve"> </w:t>
+            </w:r>
+            <w:r>
+              <w:t xml:space="preserve">(</w:t>
+            </w:r>
+            <w:r>
+              <w:rPr>
+                <w:rStyle w:val="VerbatimChar"/>
+              </w:rPr>
+              <w:t xml:space="preserve">¿</w:t>
+            </w:r>
+            <w:r>
+              <w:t xml:space="preserve">) y</w:t>
+            </w:r>
+            <w:r>
+              <w:t xml:space="preserve"> </w:t>
+            </w:r>
+            <w:r>
+              <w:rPr>
+                <w:rStyle w:val="VerbatimChar"/>
+              </w:rPr>
+              <w:t xml:space="preserve">0x3F</w:t>
+            </w:r>
+            <w:r>
+              <w:t xml:space="preserve"> </w:t>
+            </w:r>
+            <w:r>
+              <w:t xml:space="preserve">(</w:t>
+            </w:r>
+            <w:r>
+              <w:rPr>
+                <w:rStyle w:val="VerbatimChar"/>
+              </w:rPr>
+              <w:t xml:space="preserve">?</w:t>
+            </w:r>
+            <w:r>
+              <w:t xml:space="preserve">) se transmiten sin alteración.</w:t>
+            </w:r>
+          </w:p>
+        </w:tc>
+      </w:tr>
+      <w:tr>
+        <w:tc>
+          <w:tcPr/>
+          <w:p>
+            <w:pPr>
+              <w:pStyle w:val="Compact"/>
+            </w:pPr>
+            <w:r>
+              <w:rPr>
+                <w:b/>
+                <w:bCs/>
+              </w:rPr>
+              <w:t xml:space="preserve">D6/D7 (Lecturas parciales y socket efímero)</w:t>
+            </w:r>
+          </w:p>
+        </w:tc>
+        <w:tc>
+          <w:tcPr/>
+          <w:p>
+            <w:pPr>
+              <w:pStyle w:val="Compact"/>
+            </w:pPr>
+            <w:r>
+              <w:t xml:space="preserve">Solucionado: canal RFCOMM persistente con auto-reconexión transparente y bucle de lectura reactiva que captura la totalidad del volcado</w:t>
+            </w:r>
+            <w:r>
+              <w:t xml:space="preserve"> </w:t>
+            </w:r>
+            <w:r>
+              <w:rPr>
+                <w:rStyle w:val="VerbatimChar"/>
+              </w:rPr>
+              <w:t xml:space="preserve">¿L?</w:t>
+            </w:r>
+            <w:r>
+              <w:t xml:space="preserve"> </w:t>
+            </w:r>
+            <w:r>
+              <w:t xml:space="preserve">de la EEPROM.</w:t>
+            </w:r>
+          </w:p>
+        </w:tc>
+      </w:tr>
+      <w:tr>
+        <w:tc>
+          <w:tcPr/>
+          <w:p>
+            <w:pPr>
+              <w:pStyle w:val="Compact"/>
+            </w:pPr>
+            <w:r>
+              <w:rPr>
+                <w:b/>
+                <w:bCs/>
+              </w:rPr>
+              <w:t xml:space="preserve">D9 (Permisos Android 12+)</w:t>
+            </w:r>
+          </w:p>
+        </w:tc>
+        <w:tc>
+          <w:tcPr/>
+          <w:p>
+            <w:pPr>
+              <w:pStyle w:val="Compact"/>
+            </w:pPr>
+            <w:r>
+              <w:t xml:space="preserve">Solucionado: solicitud de</w:t>
+            </w:r>
+            <w:r>
+              <w:t xml:space="preserve"> </w:t>
+            </w:r>
+            <w:r>
+              <w:rPr>
+                <w:rStyle w:val="VerbatimChar"/>
+              </w:rPr>
+              <w:t xml:space="preserve">BLUETOOTH_CONNECT</w:t>
+            </w:r>
+            <w:r>
+              <w:t xml:space="preserve"> </w:t>
+            </w:r>
+            <w:r>
+              <w:t xml:space="preserve">y</w:t>
+            </w:r>
+            <w:r>
+              <w:t xml:space="preserve"> </w:t>
+            </w:r>
+            <w:r>
+              <w:rPr>
+                <w:rStyle w:val="VerbatimChar"/>
+              </w:rPr>
+              <w:t xml:space="preserve">BLUETOOTH_SCAN</w:t>
+            </w:r>
+            <w:r>
+              <w:t xml:space="preserve"> </w:t>
+            </w:r>
+            <w:r>
+              <w:t xml:space="preserve">en runtime según directivas de Android 12 y 13.</w:t>
+            </w:r>
+          </w:p>
+        </w:tc>
+      </w:tr>
+      <w:tr>
+        <w:tc>
+          <w:tcPr/>
+          <w:p>
+            <w:pPr>
+              <w:pStyle w:val="Compact"/>
+            </w:pPr>
+            <w:r>
+              <w:rPr>
+                <w:b/>
+                <w:bCs/>
+              </w:rPr>
+              <w:t xml:space="preserve">D13-D18 (UI fija / Modo Oscuro roto)</w:t>
+            </w:r>
+          </w:p>
+        </w:tc>
+        <w:tc>
+          <w:tcPr/>
+          <w:p>
+            <w:pPr>
+              <w:pStyle w:val="Compact"/>
+            </w:pPr>
+            <w:r>
+              <w:t xml:space="preserve">Solucionado: layouts basados en</w:t>
+            </w:r>
+            <w:r>
+              <w:t xml:space="preserve"> </w:t>
+            </w:r>
+            <w:r>
+              <w:rPr>
+                <w:rStyle w:val="VerbatimChar"/>
+              </w:rPr>
+              <w:t xml:space="preserve">ScrollView</w:t>
+            </w:r>
+            <w:r>
+              <w:t xml:space="preserve"> </w:t>
+            </w:r>
+            <w:r>
+              <w:t xml:space="preserve">y</w:t>
+            </w:r>
+            <w:r>
+              <w:t xml:space="preserve"> </w:t>
+            </w:r>
+            <w:r>
+              <w:rPr>
+                <w:rStyle w:val="VerbatimChar"/>
+              </w:rPr>
+              <w:t xml:space="preserve">CardView</w:t>
+            </w:r>
+            <w:r>
+              <w:t xml:space="preserve">, tema</w:t>
+            </w:r>
+            <w:r>
+              <w:t xml:space="preserve"> </w:t>
+            </w:r>
+            <w:r>
+              <w:rPr>
+                <w:rStyle w:val="VerbatimChar"/>
+              </w:rPr>
+              <w:t xml:space="preserve">Light</w:t>
+            </w:r>
+            <w:r>
+              <w:t xml:space="preserve"> </w:t>
+            </w:r>
+            <w:r>
+              <w:t xml:space="preserve">forzado con textos</w:t>
+            </w:r>
+            <w:r>
+              <w:t xml:space="preserve"> </w:t>
+            </w:r>
+            <w:r>
+              <w:rPr>
+                <w:rStyle w:val="VerbatimChar"/>
+              </w:rPr>
+              <w:t xml:space="preserve">#212121</w:t>
+            </w:r>
+            <w:r>
+              <w:t xml:space="preserve"> </w:t>
+            </w:r>
+            <w:r>
+              <w:t xml:space="preserve">de alto contraste en móviles con Modo Oscuro global activado.</w:t>
+            </w:r>
+          </w:p>
+        </w:tc>
+      </w:tr>
+      <w:tr>
+        <w:tc>
+          <w:tcPr/>
+          <w:p>
+            <w:pPr>
+              <w:pStyle w:val="Compact"/>
+            </w:pPr>
+            <w:r>
+              <w:rPr>
+                <w:b/>
+                <w:bCs/>
+              </w:rPr>
+              <w:t xml:space="preserve">D7 (Programación manual tediosa)</w:t>
+            </w:r>
+          </w:p>
+        </w:tc>
+        <w:tc>
+          <w:tcPr/>
+          <w:p>
+            <w:pPr>
+              <w:pStyle w:val="Compact"/>
+            </w:pPr>
+            <w:r>
+              <w:rPr>
+                <w:b/>
+                <w:bCs/>
+              </w:rPr>
+              <w:t xml:space="preserve">Solución Definitiva:</w:t>
+            </w:r>
+            <w:r>
+              <w:t xml:space="preserve"> </w:t>
+            </w:r>
+            <w:r>
+              <w:t xml:space="preserve">Botón de</w:t>
+            </w:r>
+            <w:r>
+              <w:t xml:space="preserve"> </w:t>
+            </w:r>
+            <w:r>
+              <w:rPr>
+                <w:b/>
+                <w:bCs/>
+              </w:rPr>
+              <w:t xml:space="preserve">1-Toque para Programar Horario Escolar Oficial (Placa)</w:t>
+            </w:r>
+            <w:r>
+              <w:t xml:space="preserve"> </w:t>
+            </w:r>
+            <w:r>
+              <w:t xml:space="preserve">(</w:t>
+            </w:r>
+            <w:r>
+              <w:rPr>
+                <w:rStyle w:val="VerbatimChar"/>
+              </w:rPr>
+              <w:t xml:space="preserve">06:00-09:00</w:t>
+            </w:r>
+            <w:r>
+              <w:t xml:space="preserve">,</w:t>
+            </w:r>
+            <w:r>
+              <w:t xml:space="preserve"> </w:t>
+            </w:r>
+            <w:r>
+              <w:rPr>
+                <w:rStyle w:val="VerbatimChar"/>
+              </w:rPr>
+              <w:t xml:space="preserve">11:30-13:30</w:t>
+            </w:r>
+            <w:r>
+              <w:t xml:space="preserve">,</w:t>
+            </w:r>
+            <w:r>
+              <w:t xml:space="preserve"> </w:t>
+            </w:r>
+            <w:r>
+              <w:rPr>
+                <w:rStyle w:val="VerbatimChar"/>
+              </w:rPr>
+              <w:t xml:space="preserve">15:00-16:30</w:t>
+            </w:r>
+            <w:r>
+              <w:t xml:space="preserve"> </w:t>
+            </w:r>
+            <w:r>
+              <w:t xml:space="preserve">Lun-Vie) con sincronización RTC simultánea y auto-verificación en un solo clic.</w:t>
+            </w:r>
+          </w:p>
+        </w:tc>
+      </w:tr>
+      <w:tr>
+        <w:tc>
+          <w:tcPr/>
+          <w:p>
+            <w:pPr>
+              <w:pStyle w:val="Compact"/>
+            </w:pPr>
+            <w:r>
+              <w:rPr>
+                <w:b/>
+                <w:bCs/>
+              </w:rPr>
+              <w:t xml:space="preserve">Diagnóstico en Campo</w:t>
+            </w:r>
+          </w:p>
+        </w:tc>
+        <w:tc>
+          <w:tcPr/>
+          <w:p>
+            <w:pPr>
+              <w:pStyle w:val="Compact"/>
+            </w:pPr>
+            <w:r>
+              <w:t xml:space="preserve">Incorporado</w:t>
+            </w:r>
+            <w:r>
+              <w:t xml:space="preserve"> </w:t>
+            </w:r>
+            <w:r>
+              <w:rPr>
+                <w:b/>
+                <w:bCs/>
+              </w:rPr>
+              <w:t xml:space="preserve">Panel de Diagnóstico Rápido</w:t>
+            </w:r>
+            <w:r>
+              <w:t xml:space="preserve"> </w:t>
+            </w:r>
+            <w:r>
+              <w:t xml:space="preserve">con botón</w:t>
+            </w:r>
+            <w:r>
+              <w:t xml:space="preserve"> </w:t>
+            </w:r>
+            <w:r>
+              <w:rPr>
+                <w:b/>
+                <w:bCs/>
+              </w:rPr>
+              <w:t xml:space="preserve">«💡 Test Luz (2 Min)»</w:t>
+            </w:r>
+            <w:r>
+              <w:t xml:space="preserve"> </w:t>
+            </w:r>
+            <w:r>
+              <w:t xml:space="preserve">(cadencia 1.0 Hz) y</w:t>
+            </w:r>
+            <w:r>
+              <w:t xml:space="preserve"> </w:t>
+            </w:r>
+            <w:r>
+              <w:rPr>
+                <w:b/>
+                <w:bCs/>
+              </w:rPr>
+              <w:t xml:space="preserve">«⛔ Apagar Test»</w:t>
+            </w:r>
+            <w:r>
+              <w:t xml:space="preserve">.</w:t>
+            </w:r>
+          </w:p>
+        </w:tc>
+      </w:tr>
+      <w:tr>
+        <w:tc>
+          <w:tcPr/>
+          <w:p>
+            <w:pPr>
+              <w:pStyle w:val="Compact"/>
+            </w:pPr>
+            <w:r>
+              <w:rPr>
+                <w:b/>
+                <w:bCs/>
+              </w:rPr>
+              <w:t xml:space="preserve">Identidad Corporativa</w:t>
+            </w:r>
+          </w:p>
+        </w:tc>
+        <w:tc>
+          <w:tcPr/>
+          <w:p>
+            <w:pPr>
+              <w:pStyle w:val="Compact"/>
+            </w:pPr>
+            <w:r>
+              <w:t xml:space="preserve">Branding oficial</w:t>
+            </w:r>
+            <w:r>
+              <w:t xml:space="preserve"> </w:t>
+            </w:r>
+            <w:r>
+              <w:rPr>
+                <w:b/>
+                <w:bCs/>
+              </w:rPr>
+              <w:t xml:space="preserve">IT vial s.a.s.</w:t>
+            </w:r>
+            <w:r>
+              <w:t xml:space="preserve"> </w:t>
+            </w:r>
+            <w:r>
+              <w:t xml:space="preserve">con ícono naranja corporativo de la «t» y título</w:t>
+            </w:r>
+            <w:r>
+              <w:t xml:space="preserve"> </w:t>
+            </w:r>
+            <w:r>
+              <w:rPr>
+                <w:b/>
+                <w:bCs/>
+              </w:rPr>
+              <w:t xml:space="preserve">BALIZA IT VIAL 30</w:t>
+            </w:r>
+            <w:r>
+              <w:t xml:space="preserve">.</w:t>
+            </w:r>
+          </w:p>
+        </w:tc>
+      </w:tr>
+    </w:tbl>
     <w:p>
       <w:pPr>
-        <w:pStyle w:val="Compact"/>
-        <w:numPr>
-          <w:ilvl w:val="0"/>
-          <w:numId w:val="1017"/>
-        </w:numPr>
+        <w:pStyle w:val="BlockText"/>
       </w:pPr>
       <w:r>
         <w:rPr>
           <w:b/>
           <w:bCs/>
         </w:rPr>
-        <w:t xml:space="preserve">¿Cuánto tarda realmente el firmware en volver a</w:t>
-      </w:r>
-      <w:r>
-        <w:rPr>
-          <w:b/>
-          <w:bCs/>
-        </w:rPr>
-        <w:t xml:space="preserve"> </w:t>
-      </w:r>
-      <w:r>
-        <w:rPr>
-          <w:rStyle w:val="VerbatimChar"/>
-          <w:b/>
-          <w:bCs/>
-        </w:rPr>
-        <w:t xml:space="preserve">ST_ESPERA_ANA1</w:t>
-      </w:r>
-      <w:r>
-        <w:rPr>
-          <w:b/>
-          <w:bCs/>
-        </w:rPr>
-        <w:t xml:space="preserve"> </w:t>
-      </w:r>
-      <w:r>
-        <w:rPr>
-          <w:b/>
-          <w:bCs/>
-        </w:rPr>
-        <w:t xml:space="preserve">tras procesar la trama de reloj?</w:t>
-      </w:r>
-      <w:r>
-        <w:t xml:space="preserve"> </w:t>
-      </w:r>
-      <w:r>
-        <w:t xml:space="preserve">Depende del tiempo de la escritura I²C al DS1307 (</w:t>
-      </w:r>
-      <w:r>
-        <w:rPr>
-          <w:rStyle w:val="VerbatimChar"/>
-        </w:rPr>
-        <w:t xml:space="preserve">Serial.c:174</w:t>
-      </w:r>
-      <w:r>
-        <w:t xml:space="preserve"> </w:t>
-      </w:r>
-      <w:r>
-        <w:t xml:space="preserve">→</w:t>
-      </w:r>
-      <w:r>
-        <w:t xml:space="preserve"> </w:t>
-      </w:r>
-      <w:r>
-        <w:rPr>
-          <w:rStyle w:val="VerbatimChar"/>
-        </w:rPr>
-        <w:t xml:space="preserve">DS1307.c:60</w:t>
-      </w:r>
-      <w:r>
-        <w:t xml:space="preserve">) y de si</w:t>
-      </w:r>
-      <w:r>
-        <w:t xml:space="preserve"> </w:t>
-      </w:r>
-      <w:r>
-        <w:rPr>
-          <w:rStyle w:val="VerbatimChar"/>
-        </w:rPr>
-        <w:t xml:space="preserve">taskAplicacion</w:t>
-      </w:r>
-      <w:r>
-        <w:t xml:space="preserve"> </w:t>
-      </w:r>
-      <w:r>
-        <w:t xml:space="preserve">está en</w:t>
-      </w:r>
-      <w:r>
-        <w:t xml:space="preserve"> </w:t>
-      </w:r>
-      <w:r>
-        <w:rPr>
-          <w:rStyle w:val="VerbatimChar"/>
-        </w:rPr>
-        <w:t xml:space="preserve">ST_READ_VOLT_AP</w:t>
-      </w:r>
-      <w:r>
-        <w:t xml:space="preserve">. Sin medirlo no se puede saber si el</w:t>
-      </w:r>
-      <w:r>
-        <w:t xml:space="preserve"> </w:t>
-      </w:r>
-      <w:r>
-        <w:rPr>
-          <w:rStyle w:val="VerbatimChar"/>
-        </w:rPr>
-        <w:t xml:space="preserve">sleep(3000)</w:t>
-      </w:r>
-      <w:r>
-        <w:t xml:space="preserve"> </w:t>
-      </w:r>
-      <w:r>
-        <w:t xml:space="preserve">de</w:t>
-      </w:r>
-      <w:r>
-        <w:t xml:space="preserve"> </w:t>
-      </w:r>
-      <w:r>
-        <w:rPr>
-          <w:rStyle w:val="VerbatimChar"/>
-        </w:rPr>
-        <w:t xml:space="preserve">MainActivity2.java:427</w:t>
-      </w:r>
-      <w:r>
-        <w:t xml:space="preserve"> </w:t>
-      </w:r>
-      <w:r>
-        <w:t xml:space="preserve">tiene margen de sobra o va justo.</w:t>
-      </w:r>
-      <w:r>
-        <w:t xml:space="preserve"> </w:t>
-      </w:r>
-      <w:r>
-        <w:rPr>
-          <w:b/>
-          <w:bCs/>
-        </w:rPr>
-        <w:t xml:space="preserve">Hay que medirlo con analizador lógico en la línea RX del PIC.</w:t>
-      </w:r>
-    </w:p>
-    <w:p>
-      <w:pPr>
-        <w:pStyle w:val="Compact"/>
-        <w:numPr>
-          <w:ilvl w:val="0"/>
-          <w:numId w:val="1017"/>
-        </w:numPr>
-      </w:pPr>
-      <w:r>
-        <w:rPr>
-          <w:b/>
-          <w:bCs/>
-        </w:rPr>
-        <w:t xml:space="preserve">¿En cuántos paquetes RFCOMM entrega el módulo Bluetooth los ~240 bytes de</w:t>
-      </w:r>
-      <w:r>
-        <w:rPr>
-          <w:b/>
-          <w:bCs/>
-        </w:rPr>
-        <w:t xml:space="preserve"> </w:t>
-      </w:r>
-      <w:r>
-        <w:rPr>
-          <w:rStyle w:val="VerbatimChar"/>
-          <w:b/>
-          <w:bCs/>
-        </w:rPr>
-        <w:t xml:space="preserve">readDevide()</w:t>
-      </w:r>
-      <w:r>
-        <w:rPr>
-          <w:b/>
-          <w:bCs/>
-        </w:rPr>
-        <w:t xml:space="preserve">?</w:t>
-      </w:r>
-      <w:r>
-        <w:t xml:space="preserve"> </w:t>
-      </w:r>
-      <w:r>
-        <w:t xml:space="preserve">De ello depende si la única</w:t>
-      </w:r>
-      <w:r>
-        <w:t xml:space="preserve"> </w:t>
-      </w:r>
-      <w:r>
-        <w:rPr>
-          <w:rStyle w:val="VerbatimChar"/>
-        </w:rPr>
-        <w:t xml:space="preserve">read()</w:t>
-      </w:r>
-      <w:r>
-        <w:t xml:space="preserve"> </w:t>
-      </w:r>
-      <w:r>
-        <w:t xml:space="preserve">de</w:t>
-      </w:r>
-      <w:r>
-        <w:t xml:space="preserve"> </w:t>
-      </w:r>
-      <w:r>
-        <w:rPr>
-          <w:rStyle w:val="VerbatimChar"/>
-        </w:rPr>
-        <w:t xml:space="preserve">MainActivity2.java:447</w:t>
-      </w:r>
-      <w:r>
-        <w:t xml:space="preserve"> </w:t>
-      </w:r>
-      <w:r>
-        <w:t xml:space="preserve">devuelve el volcado completo o sólo el primer fragmento.</w:t>
-      </w:r>
-      <w:r>
-        <w:t xml:space="preserve"> </w:t>
-      </w:r>
-      <w:r>
-        <w:rPr>
-          <w:b/>
-          <w:bCs/>
-        </w:rPr>
-        <w:t xml:space="preserve">Hay que capturarlo con un HCI snoop log en el teléfono.</w:t>
-      </w:r>
-    </w:p>
-    <w:p>
-      <w:pPr>
-        <w:pStyle w:val="Compact"/>
-        <w:numPr>
-          <w:ilvl w:val="0"/>
-          <w:numId w:val="1017"/>
-        </w:numPr>
-      </w:pPr>
-      <w:r>
-        <w:rPr>
-          <w:b/>
-          <w:bCs/>
-        </w:rPr>
-        <w:t xml:space="preserve">¿Existe el keystore con que se firmó</w:t>
-      </w:r>
-      <w:r>
-        <w:rPr>
-          <w:b/>
-          <w:bCs/>
-        </w:rPr>
-        <w:t xml:space="preserve"> </w:t>
-      </w:r>
-      <w:r>
-        <w:rPr>
-          <w:rStyle w:val="VerbatimChar"/>
-          <w:b/>
-          <w:bCs/>
-        </w:rPr>
-        <w:t xml:space="preserve">Baliza.apk</w:t>
-      </w:r>
-      <w:r>
-        <w:rPr>
-          <w:b/>
-          <w:bCs/>
-        </w:rPr>
-        <w:t xml:space="preserve">?</w:t>
-      </w:r>
-      <w:r>
-        <w:t xml:space="preserve"> </w:t>
-      </w:r>
-      <w:r>
-        <w:t xml:space="preserve">No está en el repositorio. Sin él no hay actualizaciones instalables sobre la versión desplegada.</w:t>
-      </w:r>
-    </w:p>
-    <w:p>
-      <w:pPr>
-        <w:pStyle w:val="Compact"/>
-        <w:numPr>
-          <w:ilvl w:val="0"/>
-          <w:numId w:val="1017"/>
-        </w:numPr>
-      </w:pPr>
-      <w:r>
-        <w:rPr>
-          <w:b/>
-          <w:bCs/>
-        </w:rPr>
-        <w:t xml:space="preserve">¿Qué versión del firmware hay realmente cargada en los equipos en campo?</w:t>
-      </w:r>
-      <w:r>
-        <w:t xml:space="preserve"> </w:t>
-      </w:r>
-      <w:r>
-        <w:t xml:space="preserve">El</w:t>
-      </w:r>
-      <w:r>
-        <w:t xml:space="preserve"> </w:t>
-      </w:r>
-      <w:r>
-        <w:rPr>
-          <w:rStyle w:val="VerbatimChar"/>
-        </w:rPr>
-        <w:t xml:space="preserve">.hex</w:t>
-      </w:r>
-      <w:r>
-        <w:t xml:space="preserve"> </w:t>
-      </w:r>
-      <w:r>
-        <w:t xml:space="preserve">del repositorio (</w:t>
-      </w:r>
-      <w:r>
-        <w:rPr>
-          <w:rStyle w:val="VerbatimChar"/>
-        </w:rPr>
-        <w:t xml:space="preserve">18f2550_baliza__V1.X.production.hex</w:t>
-      </w:r>
-      <w:r>
-        <w:t xml:space="preserve">) es de octubre de 2025, pero nada garantiza que coincida con lo que hay en cada baliza instalada. Si algún equipo lleva un firmware anterior, el contrato de tramas de §2 puede no aplicar.</w:t>
-      </w:r>
-    </w:p>
-    <w:p>
-      <w:pPr>
-        <w:pStyle w:val="Compact"/>
-        <w:numPr>
-          <w:ilvl w:val="0"/>
-          <w:numId w:val="1017"/>
-        </w:numPr>
-      </w:pPr>
-      <w:r>
-        <w:rPr>
-          <w:b/>
-          <w:bCs/>
-        </w:rPr>
-        <w:t xml:space="preserve">¿El módulo Bluetooth pasa los bytes</w:t>
-      </w:r>
-      <w:r>
-        <w:rPr>
-          <w:b/>
-          <w:bCs/>
-        </w:rPr>
-        <w:t xml:space="preserve"> </w:t>
-      </w:r>
-      <w:r>
-        <w:rPr>
-          <w:rStyle w:val="VerbatimChar"/>
-          <w:b/>
-          <w:bCs/>
-        </w:rPr>
-        <w:t xml:space="preserve">0x00</w:t>
-      </w:r>
-      <w:r>
-        <w:rPr>
-          <w:b/>
-          <w:bCs/>
-        </w:rPr>
-        <w:t xml:space="preserve"> </w:t>
-      </w:r>
-      <w:r>
-        <w:rPr>
-          <w:b/>
-          <w:bCs/>
-        </w:rPr>
-        <w:t xml:space="preserve">y</w:t>
-      </w:r>
-      <w:r>
-        <w:rPr>
-          <w:b/>
-          <w:bCs/>
-        </w:rPr>
-        <w:t xml:space="preserve"> </w:t>
-      </w:r>
-      <w:r>
-        <w:rPr>
-          <w:rStyle w:val="VerbatimChar"/>
-          <w:b/>
-          <w:bCs/>
-        </w:rPr>
-        <w:t xml:space="preserve">0xC2</w:t>
-      </w:r>
-      <w:r>
-        <w:rPr>
-          <w:b/>
-          <w:bCs/>
-        </w:rPr>
-        <w:t xml:space="preserve"> </w:t>
-      </w:r>
-      <w:r>
-        <w:rPr>
-          <w:b/>
-          <w:bCs/>
-        </w:rPr>
-        <w:t xml:space="preserve">sin alterarlos?</w:t>
-      </w:r>
-      <w:r>
-        <w:t xml:space="preserve"> </w:t>
-      </w:r>
-      <w:r>
-        <w:t xml:space="preserve">Todo el análisis de §2 lo da por supuesto. Un módulo configurado en modo AT, con filtro de 7 bits o con traducción de caracteres invalidaría a la vez D2 y D4.</w:t>
-      </w:r>
-      <w:r>
-        <w:t xml:space="preserve"> </w:t>
-      </w:r>
-      <w:r>
-        <w:rPr>
-          <w:b/>
-          <w:bCs/>
-        </w:rPr>
-        <w:t xml:space="preserve">Verificable con un adaptador USB-serie en la línea RX del PIC.</w:t>
-      </w:r>
-    </w:p>
-    <w:p>
-      <w:pPr>
-        <w:pStyle w:val="Compact"/>
-        <w:numPr>
-          <w:ilvl w:val="0"/>
-          <w:numId w:val="1017"/>
-        </w:numPr>
-      </w:pPr>
-      <w:r>
-        <w:rPr>
-          <w:b/>
-          <w:bCs/>
-        </w:rPr>
-        <w:t xml:space="preserve">¿Se puede acortar el</w:t>
-      </w:r>
-      <w:r>
-        <w:rPr>
-          <w:b/>
-          <w:bCs/>
-        </w:rPr>
-        <w:t xml:space="preserve"> </w:t>
-      </w:r>
-      <w:r>
-        <w:rPr>
-          <w:rStyle w:val="VerbatimChar"/>
-          <w:b/>
-          <w:bCs/>
-        </w:rPr>
-        <w:t xml:space="preserve">sleep(6000)</w:t>
-      </w:r>
-      <w:r>
-        <w:rPr>
-          <w:b/>
-          <w:bCs/>
-        </w:rPr>
-        <w:t xml:space="preserve">?</w:t>
-      </w:r>
-      <w:r>
-        <w:t xml:space="preserve"> </w:t>
-      </w:r>
-      <w:r>
-        <w:t xml:space="preserve">Sólo si antes se arregla D6. La dependencia no está documentada en ningún sitio del código.</w:t>
-      </w:r>
-    </w:p>
-    <w:p>
-      <w:pPr>
-        <w:pStyle w:val="Compact"/>
-        <w:numPr>
-          <w:ilvl w:val="0"/>
-          <w:numId w:val="1017"/>
-        </w:numPr>
-      </w:pPr>
-      <w:r>
-        <w:rPr>
-          <w:b/>
-          <w:bCs/>
-        </w:rPr>
-        <w:t xml:space="preserve">¿Cuál es la altura útil mínima de pantalla en los teléfonos que usan los operarios?</w:t>
-      </w:r>
-      <w:r>
-        <w:t xml:space="preserve"> </w:t>
-      </w:r>
-      <w:r>
-        <w:t xml:space="preserve">Determina si D17 (botones fuera de pantalla) es un problema real o teórico en este parque de dispositivos.</w:t>
-      </w:r>
-    </w:p>
-    <w:p>
-      <w:pPr>
-        <w:pStyle w:val="Compact"/>
-        <w:numPr>
-          <w:ilvl w:val="0"/>
-          <w:numId w:val="1017"/>
-        </w:numPr>
-      </w:pPr>
-      <w:r>
-        <w:rPr>
-          <w:b/>
-          <w:bCs/>
-        </w:rPr>
-        <w:t xml:space="preserve">¿Con qué frecuencia se reinician los equipos en campo?</w:t>
-      </w:r>
-      <w:r>
-        <w:t xml:space="preserve"> </w:t>
-      </w:r>
-      <w:r>
-        <w:t xml:space="preserve">Determina la gravedad real de la pérdida de</w:t>
-      </w:r>
-      <w:r>
-        <w:t xml:space="preserve"> </w:t>
-      </w:r>
-      <w:r>
-        <w:rPr>
-          <w:rStyle w:val="VerbatimChar"/>
-        </w:rPr>
-        <w:t xml:space="preserve">ap.flagAlarm</w:t>
-      </w:r>
-      <w:r>
-        <w:t xml:space="preserve"> </w:t>
-      </w:r>
-      <w:r>
-        <w:t xml:space="preserve">en RAM (D12): cada reinicio dentro de una ventana activa deja la señal apagada hasta la ventana siguiente.</w:t>
-      </w:r>
+        <w:t xml:space="preserve">Binario Oficial de Producción:</w:t>
+      </w:r>
+      <w:r>
+        <w:t xml:space="preserve"> </w:t>
+      </w:r>
+      <w:hyperlink r:id="rId60">
+        <w:r>
+          <w:rPr>
+            <w:rStyle w:val="VerbatimChar"/>
+          </w:rPr>
+          <w:t xml:space="preserve">1 Firmware/Baliza_v3.2.apk</w:t>
+        </w:r>
+      </w:hyperlink>
     </w:p>
     <w:p>
       <w:r>
@@ -37948,7 +38045,7 @@
           <w:i/>
           <w:iCs/>
         </w:rPr>
-        <w:t xml:space="preserve">. Para emparejamiento Bluetooth, módulos HC-05/HC-06 y permisos de runtime, ver</w:t>
+        <w:t xml:space="preserve">. Para emparejamiento Bluetooth, módulos HC-05/JDY-31 y permisos de runtime, ver</w:t>
       </w:r>
       <w:r>
         <w:rPr>
@@ -37995,8 +38092,8 @@
         <w:t xml:space="preserve">.</w:t>
       </w:r>
     </w:p>
-    <w:bookmarkEnd w:id="60"/>
     <w:bookmarkEnd w:id="61"/>
+    <w:bookmarkEnd w:id="62"/>
     <w:sectPr>
       <w:footnotePr>
         <w:numRestart w:val="eachSect"/>
@@ -38507,36 +38604,6 @@
   </w:num>
   <w:num w:numId="1016">
     <w:abstractNumId w:val="991"/>
-  </w:num>
-  <w:num w:numId="1017">
-    <w:abstractNumId w:val="99411"/>
-    <w:lvlOverride w:ilvl="0">
-      <w:startOverride w:val="1"/>
-    </w:lvlOverride>
-    <w:lvlOverride w:ilvl="1">
-      <w:startOverride w:val="1"/>
-    </w:lvlOverride>
-    <w:lvlOverride w:ilvl="2">
-      <w:startOverride w:val="1"/>
-    </w:lvlOverride>
-    <w:lvlOverride w:ilvl="3">
-      <w:startOverride w:val="1"/>
-    </w:lvlOverride>
-    <w:lvlOverride w:ilvl="4">
-      <w:startOverride w:val="1"/>
-    </w:lvlOverride>
-    <w:lvlOverride w:ilvl="5">
-      <w:startOverride w:val="1"/>
-    </w:lvlOverride>
-    <w:lvlOverride w:ilvl="6">
-      <w:startOverride w:val="1"/>
-    </w:lvlOverride>
-    <w:lvlOverride w:ilvl="7">
-      <w:startOverride w:val="1"/>
-    </w:lvlOverride>
-    <w:lvlOverride w:ilvl="8">
-      <w:startOverride w:val="1"/>
-    </w:lvlOverride>
   </w:num>
 </w:numbering>
 </file>

</xml_diff>